<commit_message>
Update Econometrica publication and refresh CV
</commit_message>
<xml_diff>
--- a/papers/CV/JONATHON HAZELL.docx
+++ b/papers/CV/JONATHON HAZELL.docx
@@ -88,25 +88,23 @@
                 <w:szCs w:val="20"/>
                 <w:lang w:val="en-GB"/>
               </w:rPr>
-              <w:t>June</w:t>
-            </w:r>
-            <w:r>
-              <w:rPr>
-                <w:bCs/>
-                <w:sz w:val="20"/>
-                <w:szCs w:val="20"/>
-                <w:lang w:val="en-GB"/>
-              </w:rPr>
-              <w:t xml:space="preserve"> 202</w:t>
-            </w:r>
-            <w:r>
-              <w:rPr>
-                <w:bCs/>
-                <w:sz w:val="20"/>
-                <w:szCs w:val="20"/>
-                <w:lang w:val="en-GB"/>
-              </w:rPr>
-              <w:t>6</w:t>
+              <w:t>September 2026</w:t>
+            </w:r>
+            <w:r>
+              <w:rPr>
+                <w:bCs/>
+                <w:sz w:val="20"/>
+                <w:szCs w:val="20"/>
+                <w:lang w:val="en-GB"/>
+              </w:rPr>
+            </w:r>
+            <w:r>
+              <w:rPr>
+                <w:bCs/>
+                <w:sz w:val="20"/>
+                <w:szCs w:val="20"/>
+                <w:lang w:val="en-GB"/>
+              </w:rPr>
             </w:r>
           </w:p>
         </w:tc>
@@ -389,7 +387,7 @@
                 <w:szCs w:val="20"/>
                 <w:lang w:val="en-GB"/>
               </w:rPr>
-              <w:t>https://sites.google.com/view/jadhazell</w:t>
+              <w:t>https://www.jhazell.co.uk</w:t>
             </w:r>
           </w:p>
         </w:tc>
@@ -2531,6 +2529,7 @@
       <w:tr>
         <w:trPr>
           <w:trHeight w:val="285"/>
+          <w:cantSplit/>
         </w:trPr>
         <w:tc>
           <w:tcPr>
@@ -2543,6 +2542,209 @@
           <w:p>
             <w:pPr>
               <w:pStyle w:val="Body"/>
+              <w:keepLines/>
+              <w:pBdr>
+                <w:top w:val="none" w:sz="0" w:space="0" w:color="auto"/>
+                <w:left w:val="none" w:sz="0" w:space="0" w:color="auto"/>
+                <w:bottom w:val="none" w:sz="0" w:space="0" w:color="auto"/>
+                <w:right w:val="none" w:sz="0" w:space="0" w:color="auto"/>
+                <w:between w:val="none" w:sz="0" w:space="0" w:color="auto"/>
+                <w:bar w:val="none" w:sz="0" w:color="auto"/>
+              </w:pBdr>
+              <w:ind w:left="720"/>
+              <w:jc w:val="both"/>
+              <w:rPr>
+                <w:bCs/>
+                <w:sz w:val="20"/>
+                <w:szCs w:val="20"/>
+                <w:lang w:val="en-GB"/>
+              </w:rPr>
+            </w:pPr>
+            <w:r>
+              <w:rPr>
+                <w:bCs/>
+                <w:sz w:val="20"/>
+                <w:szCs w:val="20"/>
+                <w:lang w:val="en-GB"/>
+              </w:rPr>
+              <w:t>“The Macroeconomic Effect of Stimulus Checks: Evidence from Postwar Veterans’ Payments.” With Joao Guerreiro, Diego R. Känzig and Ed Manuel. July 2026.</w:t>
+            </w:r>
+          </w:p>
+          <w:p>
+            <w:pPr>
+              <w:pStyle w:val="Body"/>
+              <w:pBdr>
+                <w:top w:val="none" w:sz="0" w:space="0" w:color="auto"/>
+                <w:left w:val="none" w:sz="0" w:space="0" w:color="auto"/>
+                <w:bottom w:val="none" w:sz="0" w:space="0" w:color="auto"/>
+                <w:right w:val="none" w:sz="0" w:space="0" w:color="auto"/>
+                <w:between w:val="none" w:sz="0" w:space="0" w:color="auto"/>
+                <w:bar w:val="none" w:sz="0" w:color="auto"/>
+              </w:pBdr>
+              <w:ind w:left="720"/>
+              <w:jc w:val="both"/>
+              <w:rPr>
+                <w:bCs/>
+                <w:sz w:val="20"/>
+                <w:szCs w:val="20"/>
+                <w:lang w:val="en-GB"/>
+              </w:rPr>
+            </w:pPr>
+          </w:p>
+        </w:tc>
+      </w:tr>
+      <w:tr>
+        <w:trPr>
+          <w:trHeight w:val="285"/>
+          <w:cantSplit/>
+        </w:trPr>
+        <w:tc>
+          <w:tcPr>
+            <w:tcW w:w="9740" w:type="dxa"/>
+            <w:gridSpan w:val="3"/>
+            <w:tcBorders>
+              <w:top w:val="nil" w:sz="4" w:space="0" w:color="auto"/>
+            </w:tcBorders>
+          </w:tcPr>
+          <w:p>
+            <w:pPr>
+              <w:pStyle w:val="Body"/>
+              <w:keepLines/>
+              <w:pBdr>
+                <w:top w:val="none" w:sz="0" w:space="0" w:color="auto"/>
+                <w:left w:val="none" w:sz="0" w:space="0" w:color="auto"/>
+                <w:bottom w:val="none" w:sz="0" w:space="0" w:color="auto"/>
+                <w:right w:val="none" w:sz="0" w:space="0" w:color="auto"/>
+                <w:between w:val="none" w:sz="0" w:space="0" w:color="auto"/>
+                <w:bar w:val="none" w:sz="0" w:color="auto"/>
+              </w:pBdr>
+              <w:ind w:left="720"/>
+              <w:jc w:val="both"/>
+              <w:rPr>
+                <w:bCs/>
+                <w:sz w:val="20"/>
+                <w:szCs w:val="20"/>
+                <w:lang w:val="en-GB"/>
+              </w:rPr>
+            </w:pPr>
+            <w:r>
+              <w:rPr>
+                <w:bCs/>
+                <w:sz w:val="20"/>
+                <w:szCs w:val="20"/>
+                <w:lang w:val="en-GB"/>
+              </w:rPr>
+              <w:t>“Forecasting Inflation with Microdata: An Adaptive Machine Learning Approach.” With Catherine Chen, Chen Gao, Lihua Lei and Chen Lian. July 2026. Preliminary draft.</w:t>
+            </w:r>
+          </w:p>
+          <w:p>
+            <w:pPr>
+              <w:pStyle w:val="Body"/>
+              <w:pBdr>
+                <w:top w:val="none" w:sz="0" w:space="0" w:color="auto"/>
+                <w:left w:val="none" w:sz="0" w:space="0" w:color="auto"/>
+                <w:bottom w:val="none" w:sz="0" w:space="0" w:color="auto"/>
+                <w:right w:val="none" w:sz="0" w:space="0" w:color="auto"/>
+                <w:between w:val="none" w:sz="0" w:space="0" w:color="auto"/>
+                <w:bar w:val="none" w:sz="0" w:color="auto"/>
+              </w:pBdr>
+              <w:ind w:left="720"/>
+              <w:jc w:val="both"/>
+              <w:rPr>
+                <w:bCs/>
+                <w:sz w:val="20"/>
+                <w:szCs w:val="20"/>
+                <w:lang w:val="en-GB"/>
+              </w:rPr>
+            </w:pPr>
+          </w:p>
+        </w:tc>
+      </w:tr>
+      <w:tr>
+        <w:trPr>
+          <w:trHeight w:val="285"/>
+          <w:cantSplit/>
+        </w:trPr>
+        <w:tc>
+          <w:tcPr>
+            <w:tcW w:w="9740" w:type="dxa"/>
+            <w:gridSpan w:val="3"/>
+            <w:tcBorders>
+              <w:top w:val="nil" w:sz="4" w:space="0" w:color="auto"/>
+            </w:tcBorders>
+          </w:tcPr>
+          <w:p>
+            <w:pPr>
+              <w:pStyle w:val="Body"/>
+              <w:keepLines/>
+              <w:pBdr>
+                <w:top w:val="none" w:sz="0" w:space="0" w:color="auto"/>
+                <w:left w:val="none" w:sz="0" w:space="0" w:color="auto"/>
+                <w:bottom w:val="none" w:sz="0" w:space="0" w:color="auto"/>
+                <w:right w:val="none" w:sz="0" w:space="0" w:color="auto"/>
+                <w:between w:val="none" w:sz="0" w:space="0" w:color="auto"/>
+                <w:bar w:val="none" w:sz="0" w:color="auto"/>
+              </w:pBdr>
+              <w:ind w:left="720"/>
+              <w:jc w:val="both"/>
+              <w:rPr>
+                <w:bCs/>
+                <w:sz w:val="20"/>
+                <w:szCs w:val="20"/>
+                <w:lang w:val="en-GB"/>
+              </w:rPr>
+            </w:pPr>
+            <w:r>
+              <w:rPr>
+                <w:bCs/>
+                <w:sz w:val="20"/>
+                <w:szCs w:val="20"/>
+                <w:lang w:val="en-GB"/>
+              </w:rPr>
+              <w:t>“The Macroeconomic Effect of AI: Sizing the Software Engineering Channel.” With Alex Blumenfeld, Chen Lian and Andreas Schaab. July 2026. Preliminary draft.</w:t>
+            </w:r>
+          </w:p>
+          <w:p>
+            <w:pPr>
+              <w:pStyle w:val="Body"/>
+              <w:pBdr>
+                <w:top w:val="none" w:sz="0" w:space="0" w:color="auto"/>
+                <w:left w:val="none" w:sz="0" w:space="0" w:color="auto"/>
+                <w:bottom w:val="none" w:sz="0" w:space="0" w:color="auto"/>
+                <w:right w:val="none" w:sz="0" w:space="0" w:color="auto"/>
+                <w:between w:val="none" w:sz="0" w:space="0" w:color="auto"/>
+                <w:bar w:val="none" w:sz="0" w:color="auto"/>
+              </w:pBdr>
+              <w:ind w:left="720"/>
+              <w:jc w:val="both"/>
+              <w:rPr>
+                <w:bCs/>
+                <w:sz w:val="20"/>
+                <w:szCs w:val="20"/>
+                <w:lang w:val="en-GB"/>
+              </w:rPr>
+            </w:pPr>
+          </w:p>
+        </w:tc>
+      </w:tr>
+      <w:tr>
+        <w:trPr>
+          <w:trHeight w:val="285"/>
+          <w:cantSplit/>
+        </w:trPr>
+        <w:tc>
+          <w:tcPr>
+            <w:tcW w:w="9740" w:type="dxa"/>
+            <w:gridSpan w:val="3"/>
+            <w:tcBorders>
+              <w:top w:val="nil" w:sz="4" w:space="0" w:color="auto"/>
+            </w:tcBorders>
+          </w:tcPr>
+          <w:p>
+            <w:pPr>
+              <w:pStyle w:val="Body"/>
+              <w:keepNext/>
+              <w:keepLines/>
               <w:pBdr>
                 <w:top w:val="none" w:sz="0" w:space="0" w:color="auto"/>
                 <w:left w:val="none" w:sz="0" w:space="0" w:color="auto"/>
@@ -2589,7 +2791,7 @@
                 <w:szCs w:val="20"/>
                 <w:lang w:val="en-GB"/>
               </w:rPr>
-              <w:t>.” With Angus Foulis, Atif Main and Belinda Tracey. 2026.</w:t>
+              <w:t>.” With Angus Foulis, Atif Mian and Belinda Tracey. 2026.</w:t>
             </w:r>
           </w:p>
           <w:p>
@@ -2663,6 +2865,21 @@
               </w:rPr>
             </w:pPr>
           </w:p>
+        </w:tc>
+      </w:tr>
+      <w:tr>
+        <w:trPr>
+          <w:trHeight w:val="285"/>
+          <w:cantSplit/>
+        </w:trPr>
+        <w:tc>
+          <w:tcPr>
+            <w:tcW w:w="9740" w:type="dxa"/>
+            <w:gridSpan w:val="3"/>
+            <w:tcBorders>
+              <w:top w:val="nil" w:sz="4" w:space="0" w:color="auto"/>
+            </w:tcBorders>
+          </w:tcPr>
           <w:p>
             <w:pPr>
               <w:pStyle w:val="Body"/>
@@ -2732,9 +2949,26 @@
               </w:rPr>
             </w:pPr>
           </w:p>
-          <w:p>
-            <w:pPr>
-              <w:pStyle w:val="Body"/>
+        </w:tc>
+      </w:tr>
+      <w:tr>
+        <w:trPr>
+          <w:trHeight w:val="285"/>
+          <w:cantSplit/>
+        </w:trPr>
+        <w:tc>
+          <w:tcPr>
+            <w:tcW w:w="9740" w:type="dxa"/>
+            <w:gridSpan w:val="3"/>
+            <w:tcBorders>
+              <w:top w:val="nil" w:sz="4" w:space="0" w:color="auto"/>
+            </w:tcBorders>
+          </w:tcPr>
+          <w:p>
+            <w:pPr>
+              <w:pStyle w:val="Body"/>
+              <w:keepNext/>
+              <w:keepLines/>
               <w:pBdr>
                 <w:top w:val="none" w:sz="0" w:space="0" w:color="auto"/>
                 <w:left w:val="none" w:sz="0" w:space="0" w:color="auto"/>
@@ -3004,6 +3238,8 @@
           <w:p>
             <w:pPr>
               <w:pStyle w:val="Body"/>
+              <w:keepNext/>
+              <w:keepLines/>
               <w:pBdr>
                 <w:top w:val="none" w:sz="0" w:space="0" w:color="auto"/>
                 <w:left w:val="none" w:sz="0" w:space="0" w:color="auto"/>
@@ -3024,34 +3260,29 @@
             <w:r>
               <w:rPr>
                 <w:bCs/>
-                <w:sz w:val="20"/>
-                <w:szCs w:val="20"/>
-                <w:lang w:val="en-GB"/>
-              </w:rPr>
-              <w:t>“Why Do Workers Dislike Inflation? Wage Erosion and Conflict Costs.” With Joao Guerreiro, Chen Lian and Christina Patterson. 202</w:t>
-            </w:r>
-            <w:r>
-              <w:rPr>
-                <w:bCs/>
-                <w:sz w:val="20"/>
-                <w:szCs w:val="20"/>
-                <w:lang w:val="en-GB"/>
-              </w:rPr>
-              <w:t>6</w:t>
-            </w:r>
-            <w:r>
-              <w:rPr>
-                <w:bCs/>
-                <w:sz w:val="20"/>
-                <w:szCs w:val="20"/>
-                <w:lang w:val="en-GB"/>
-              </w:rPr>
-              <w:t xml:space="preserve">. </w:t>
-            </w:r>
-          </w:p>
-          <w:p>
-            <w:pPr>
-              <w:pStyle w:val="Body"/>
+                <w:i w:val="0"/>
+                <w:sz w:val="20"/>
+                <w:szCs w:val="20"/>
+                <w:lang w:val="en-GB"/>
+              </w:rPr>
+              <w:t xml:space="preserve">“Why Do Workers Dislike Inflation? Wage Erosion and Conflict Costs.” With Joao Guerreiro, Chen Lian and Christina Patterson. September 2026, </w:t>
+            </w:r>
+            <w:r>
+              <w:rPr>
+                <w:bCs/>
+                <w:i/>
+                <w:sz w:val="20"/>
+                <w:szCs w:val="20"/>
+                <w:lang w:val="en-GB"/>
+              </w:rPr>
+              <w:t>Econometrica.</w:t>
+            </w:r>
+          </w:p>
+          <w:p>
+            <w:pPr>
+              <w:pStyle w:val="Body"/>
+              <w:keepNext/>
+              <w:keepLines/>
               <w:pBdr>
                 <w:top w:val="none" w:sz="0" w:space="0" w:color="auto"/>
                 <w:left w:val="none" w:sz="0" w:space="0" w:color="auto"/>
@@ -3090,71 +3321,6 @@
                 <w:lang w:val="en-GB"/>
               </w:rPr>
               <w:t>he SCOR-PSE Junior Research Prize</w:t>
-            </w:r>
-          </w:p>
-          <w:p>
-            <w:pPr>
-              <w:pStyle w:val="Body"/>
-              <w:pBdr>
-                <w:top w:val="none" w:sz="0" w:space="0" w:color="auto"/>
-                <w:left w:val="none" w:sz="0" w:space="0" w:color="auto"/>
-                <w:bottom w:val="none" w:sz="0" w:space="0" w:color="auto"/>
-                <w:right w:val="none" w:sz="0" w:space="0" w:color="auto"/>
-                <w:between w:val="none" w:sz="0" w:space="0" w:color="auto"/>
-                <w:bar w:val="none" w:sz="0" w:color="auto"/>
-              </w:pBdr>
-              <w:ind w:left="720"/>
-              <w:jc w:val="both"/>
-              <w:rPr>
-                <w:bCs/>
-                <w:i/>
-                <w:iCs/>
-                <w:sz w:val="20"/>
-                <w:szCs w:val="20"/>
-                <w:lang w:val="en-GB"/>
-              </w:rPr>
-            </w:pPr>
-            <w:r>
-              <w:rPr>
-                <w:bCs/>
-                <w:sz w:val="20"/>
-                <w:szCs w:val="20"/>
-                <w:lang w:val="en-GB"/>
-              </w:rPr>
-              <w:t>Forthcoming</w:t>
-            </w:r>
-            <w:r>
-              <w:rPr>
-                <w:bCs/>
-                <w:sz w:val="20"/>
-                <w:szCs w:val="20"/>
-                <w:lang w:val="en-GB"/>
-              </w:rPr>
-              <w:t xml:space="preserve">, </w:t>
-            </w:r>
-            <w:proofErr w:type="spellStart"/>
-            <w:r>
-              <w:rPr>
-                <w:bCs/>
-                <w:i/>
-                <w:iCs/>
-                <w:sz w:val="20"/>
-                <w:szCs w:val="20"/>
-                <w:lang w:val="en-GB"/>
-              </w:rPr>
-              <w:t>Econometrica</w:t>
-            </w:r>
-            <w:proofErr w:type="spellEnd"/>
-            <w:r>
-              <w:rPr>
-                <w:bCs/>
-                <w:i/>
-                <w:iCs/>
-                <w:sz w:val="20"/>
-                <w:szCs w:val="20"/>
-                <w:lang w:val="en-GB"/>
-              </w:rPr>
-              <w:t>.</w:t>
             </w:r>
           </w:p>
           <w:p>
@@ -6026,6 +6192,7 @@
       <w:tr>
         <w:trPr>
           <w:trHeight w:val="285"/>
+          <w:cantSplit/>
         </w:trPr>
         <w:tc>
           <w:tcPr>
@@ -6065,788 +6232,13 @@
           <w:p>
             <w:pPr>
               <w:pStyle w:val="Body"/>
-              <w:pBdr>
-                <w:top w:val="none" w:sz="0" w:space="0" w:color="auto"/>
-                <w:left w:val="none" w:sz="0" w:space="0" w:color="auto"/>
-                <w:bottom w:val="none" w:sz="0" w:space="0" w:color="auto"/>
-                <w:right w:val="none" w:sz="0" w:space="0" w:color="auto"/>
-                <w:between w:val="none" w:sz="0" w:space="0" w:color="auto"/>
-                <w:bar w:val="none" w:sz="0" w:color="auto"/>
-              </w:pBdr>
-              <w:rPr>
-                <w:bCs/>
-                <w:sz w:val="20"/>
-                <w:szCs w:val="20"/>
-                <w:lang w:val="en-GB"/>
-              </w:rPr>
-            </w:pPr>
-          </w:p>
-          <w:p>
-            <w:pPr>
-              <w:pStyle w:val="Body"/>
-              <w:pBdr>
-                <w:top w:val="none" w:sz="0" w:space="0" w:color="auto"/>
-                <w:left w:val="none" w:sz="0" w:space="0" w:color="auto"/>
-                <w:bottom w:val="none" w:sz="0" w:space="0" w:color="auto"/>
-                <w:right w:val="none" w:sz="0" w:space="0" w:color="auto"/>
-                <w:between w:val="none" w:sz="0" w:space="0" w:color="auto"/>
-                <w:bar w:val="none" w:sz="0" w:color="auto"/>
-              </w:pBdr>
-              <w:rPr>
-                <w:bCs/>
-                <w:sz w:val="20"/>
-                <w:szCs w:val="20"/>
-                <w:lang w:val="en-GB"/>
-              </w:rPr>
-            </w:pPr>
-          </w:p>
-          <w:p>
-            <w:pPr>
-              <w:pStyle w:val="Body"/>
-              <w:pBdr>
-                <w:top w:val="none" w:sz="0" w:space="0" w:color="auto"/>
-                <w:left w:val="none" w:sz="0" w:space="0" w:color="auto"/>
-                <w:bottom w:val="none" w:sz="0" w:space="0" w:color="auto"/>
-                <w:right w:val="none" w:sz="0" w:space="0" w:color="auto"/>
-                <w:between w:val="none" w:sz="0" w:space="0" w:color="auto"/>
-                <w:bar w:val="none" w:sz="0" w:color="auto"/>
-              </w:pBdr>
-              <w:rPr>
-                <w:bCs/>
-                <w:sz w:val="20"/>
-                <w:szCs w:val="20"/>
-                <w:lang w:val="en-GB"/>
-              </w:rPr>
-            </w:pPr>
-          </w:p>
-          <w:p>
-            <w:pPr>
-              <w:pStyle w:val="Body"/>
-              <w:pBdr>
-                <w:top w:val="none" w:sz="0" w:space="0" w:color="auto"/>
-                <w:left w:val="none" w:sz="0" w:space="0" w:color="auto"/>
-                <w:bottom w:val="none" w:sz="0" w:space="0" w:color="auto"/>
-                <w:right w:val="none" w:sz="0" w:space="0" w:color="auto"/>
-                <w:between w:val="none" w:sz="0" w:space="0" w:color="auto"/>
-                <w:bar w:val="none" w:sz="0" w:color="auto"/>
-              </w:pBdr>
-              <w:rPr>
-                <w:bCs/>
-                <w:sz w:val="20"/>
-                <w:szCs w:val="20"/>
-                <w:lang w:val="en-GB"/>
-              </w:rPr>
-            </w:pPr>
-            <w:r>
-              <w:rPr>
-                <w:bCs/>
-                <w:sz w:val="20"/>
-                <w:szCs w:val="20"/>
-                <w:lang w:val="en-GB"/>
-              </w:rPr>
-              <w:t>2025</w:t>
-            </w:r>
-          </w:p>
-          <w:p>
-            <w:pPr>
-              <w:pStyle w:val="Body"/>
-              <w:pBdr>
-                <w:top w:val="none" w:sz="0" w:space="0" w:color="auto"/>
-                <w:left w:val="none" w:sz="0" w:space="0" w:color="auto"/>
-                <w:bottom w:val="none" w:sz="0" w:space="0" w:color="auto"/>
-                <w:right w:val="none" w:sz="0" w:space="0" w:color="auto"/>
-                <w:between w:val="none" w:sz="0" w:space="0" w:color="auto"/>
-                <w:bar w:val="none" w:sz="0" w:color="auto"/>
-              </w:pBdr>
-              <w:rPr>
-                <w:bCs/>
-                <w:sz w:val="20"/>
-                <w:szCs w:val="20"/>
-                <w:lang w:val="en-GB"/>
-              </w:rPr>
-            </w:pPr>
-          </w:p>
-          <w:p>
-            <w:pPr>
-              <w:pStyle w:val="Body"/>
-              <w:pBdr>
-                <w:top w:val="none" w:sz="0" w:space="0" w:color="auto"/>
-                <w:left w:val="none" w:sz="0" w:space="0" w:color="auto"/>
-                <w:bottom w:val="none" w:sz="0" w:space="0" w:color="auto"/>
-                <w:right w:val="none" w:sz="0" w:space="0" w:color="auto"/>
-                <w:between w:val="none" w:sz="0" w:space="0" w:color="auto"/>
-                <w:bar w:val="none" w:sz="0" w:color="auto"/>
-              </w:pBdr>
-              <w:rPr>
-                <w:bCs/>
-                <w:sz w:val="20"/>
-                <w:szCs w:val="20"/>
-                <w:lang w:val="en-GB"/>
-              </w:rPr>
-            </w:pPr>
-          </w:p>
-          <w:p>
-            <w:pPr>
-              <w:pStyle w:val="Body"/>
-              <w:pBdr>
-                <w:top w:val="none" w:sz="0" w:space="0" w:color="auto"/>
-                <w:left w:val="none" w:sz="0" w:space="0" w:color="auto"/>
-                <w:bottom w:val="none" w:sz="0" w:space="0" w:color="auto"/>
-                <w:right w:val="none" w:sz="0" w:space="0" w:color="auto"/>
-                <w:between w:val="none" w:sz="0" w:space="0" w:color="auto"/>
-                <w:bar w:val="none" w:sz="0" w:color="auto"/>
-              </w:pBdr>
-              <w:rPr>
-                <w:bCs/>
-                <w:sz w:val="20"/>
-                <w:szCs w:val="20"/>
-                <w:lang w:val="en-GB"/>
-              </w:rPr>
-            </w:pPr>
-          </w:p>
-          <w:p>
-            <w:pPr>
-              <w:pStyle w:val="Body"/>
-              <w:pBdr>
-                <w:top w:val="none" w:sz="0" w:space="0" w:color="auto"/>
-                <w:left w:val="none" w:sz="0" w:space="0" w:color="auto"/>
-                <w:bottom w:val="none" w:sz="0" w:space="0" w:color="auto"/>
-                <w:right w:val="none" w:sz="0" w:space="0" w:color="auto"/>
-                <w:between w:val="none" w:sz="0" w:space="0" w:color="auto"/>
-                <w:bar w:val="none" w:sz="0" w:color="auto"/>
-              </w:pBdr>
-              <w:rPr>
-                <w:bCs/>
-                <w:sz w:val="20"/>
-                <w:szCs w:val="20"/>
-                <w:lang w:val="en-GB"/>
-              </w:rPr>
-            </w:pPr>
-          </w:p>
-          <w:p>
-            <w:pPr>
-              <w:pStyle w:val="Body"/>
-              <w:pBdr>
-                <w:top w:val="none" w:sz="0" w:space="0" w:color="auto"/>
-                <w:left w:val="none" w:sz="0" w:space="0" w:color="auto"/>
-                <w:bottom w:val="none" w:sz="0" w:space="0" w:color="auto"/>
-                <w:right w:val="none" w:sz="0" w:space="0" w:color="auto"/>
-                <w:between w:val="none" w:sz="0" w:space="0" w:color="auto"/>
-                <w:bar w:val="none" w:sz="0" w:color="auto"/>
-              </w:pBdr>
-              <w:rPr>
-                <w:bCs/>
-                <w:sz w:val="20"/>
-                <w:szCs w:val="20"/>
-                <w:lang w:val="en-GB"/>
-              </w:rPr>
-            </w:pPr>
-          </w:p>
-          <w:p>
-            <w:pPr>
-              <w:pStyle w:val="Body"/>
-              <w:pBdr>
-                <w:top w:val="none" w:sz="0" w:space="0" w:color="auto"/>
-                <w:left w:val="none" w:sz="0" w:space="0" w:color="auto"/>
-                <w:bottom w:val="none" w:sz="0" w:space="0" w:color="auto"/>
-                <w:right w:val="none" w:sz="0" w:space="0" w:color="auto"/>
-                <w:between w:val="none" w:sz="0" w:space="0" w:color="auto"/>
-                <w:bar w:val="none" w:sz="0" w:color="auto"/>
-              </w:pBdr>
-              <w:rPr>
-                <w:bCs/>
-                <w:sz w:val="20"/>
-                <w:szCs w:val="20"/>
-                <w:lang w:val="en-GB"/>
-              </w:rPr>
-            </w:pPr>
-          </w:p>
-          <w:p>
-            <w:pPr>
-              <w:pStyle w:val="Body"/>
-              <w:pBdr>
-                <w:top w:val="none" w:sz="0" w:space="0" w:color="auto"/>
-                <w:left w:val="none" w:sz="0" w:space="0" w:color="auto"/>
-                <w:bottom w:val="none" w:sz="0" w:space="0" w:color="auto"/>
-                <w:right w:val="none" w:sz="0" w:space="0" w:color="auto"/>
-                <w:between w:val="none" w:sz="0" w:space="0" w:color="auto"/>
-                <w:bar w:val="none" w:sz="0" w:color="auto"/>
-              </w:pBdr>
-              <w:rPr>
-                <w:bCs/>
-                <w:sz w:val="20"/>
-                <w:szCs w:val="20"/>
-                <w:lang w:val="en-GB"/>
-              </w:rPr>
-            </w:pPr>
-          </w:p>
-          <w:p>
-            <w:pPr>
-              <w:pStyle w:val="Body"/>
-              <w:pBdr>
-                <w:top w:val="none" w:sz="0" w:space="0" w:color="auto"/>
-                <w:left w:val="none" w:sz="0" w:space="0" w:color="auto"/>
-                <w:bottom w:val="none" w:sz="0" w:space="0" w:color="auto"/>
-                <w:right w:val="none" w:sz="0" w:space="0" w:color="auto"/>
-                <w:between w:val="none" w:sz="0" w:space="0" w:color="auto"/>
-                <w:bar w:val="none" w:sz="0" w:color="auto"/>
-              </w:pBdr>
-              <w:rPr>
-                <w:bCs/>
-                <w:sz w:val="20"/>
-                <w:szCs w:val="20"/>
-                <w:lang w:val="en-GB"/>
-              </w:rPr>
-            </w:pPr>
-          </w:p>
-          <w:p>
-            <w:pPr>
-              <w:pStyle w:val="Body"/>
-              <w:pBdr>
-                <w:top w:val="none" w:sz="0" w:space="0" w:color="auto"/>
-                <w:left w:val="none" w:sz="0" w:space="0" w:color="auto"/>
-                <w:bottom w:val="none" w:sz="0" w:space="0" w:color="auto"/>
-                <w:right w:val="none" w:sz="0" w:space="0" w:color="auto"/>
-                <w:between w:val="none" w:sz="0" w:space="0" w:color="auto"/>
-                <w:bar w:val="none" w:sz="0" w:color="auto"/>
-              </w:pBdr>
-              <w:rPr>
-                <w:bCs/>
-                <w:sz w:val="20"/>
-                <w:szCs w:val="20"/>
-                <w:lang w:val="en-GB"/>
-              </w:rPr>
-            </w:pPr>
-          </w:p>
-          <w:p>
-            <w:pPr>
-              <w:pStyle w:val="Body"/>
-              <w:pBdr>
-                <w:top w:val="none" w:sz="0" w:space="0" w:color="auto"/>
-                <w:left w:val="none" w:sz="0" w:space="0" w:color="auto"/>
-                <w:bottom w:val="none" w:sz="0" w:space="0" w:color="auto"/>
-                <w:right w:val="none" w:sz="0" w:space="0" w:color="auto"/>
-                <w:between w:val="none" w:sz="0" w:space="0" w:color="auto"/>
-                <w:bar w:val="none" w:sz="0" w:color="auto"/>
-              </w:pBdr>
-              <w:rPr>
-                <w:bCs/>
-                <w:sz w:val="20"/>
-                <w:szCs w:val="20"/>
-                <w:lang w:val="en-GB"/>
-              </w:rPr>
-            </w:pPr>
-          </w:p>
-          <w:p>
-            <w:pPr>
-              <w:pStyle w:val="Body"/>
-              <w:pBdr>
-                <w:top w:val="none" w:sz="0" w:space="0" w:color="auto"/>
-                <w:left w:val="none" w:sz="0" w:space="0" w:color="auto"/>
-                <w:bottom w:val="none" w:sz="0" w:space="0" w:color="auto"/>
-                <w:right w:val="none" w:sz="0" w:space="0" w:color="auto"/>
-                <w:between w:val="none" w:sz="0" w:space="0" w:color="auto"/>
-                <w:bar w:val="none" w:sz="0" w:color="auto"/>
-              </w:pBdr>
-              <w:rPr>
-                <w:bCs/>
-                <w:sz w:val="20"/>
-                <w:szCs w:val="20"/>
-                <w:lang w:val="en-GB"/>
-              </w:rPr>
-            </w:pPr>
-            <w:r>
-              <w:rPr>
-                <w:bCs/>
-                <w:sz w:val="20"/>
-                <w:szCs w:val="20"/>
-                <w:lang w:val="en-GB"/>
-              </w:rPr>
-              <w:t>2024</w:t>
-            </w:r>
-          </w:p>
-          <w:p>
-            <w:pPr>
-              <w:pStyle w:val="Body"/>
-              <w:pBdr>
-                <w:top w:val="none" w:sz="0" w:space="0" w:color="auto"/>
-                <w:left w:val="none" w:sz="0" w:space="0" w:color="auto"/>
-                <w:bottom w:val="none" w:sz="0" w:space="0" w:color="auto"/>
-                <w:right w:val="none" w:sz="0" w:space="0" w:color="auto"/>
-                <w:between w:val="none" w:sz="0" w:space="0" w:color="auto"/>
-                <w:bar w:val="none" w:sz="0" w:color="auto"/>
-              </w:pBdr>
-              <w:rPr>
-                <w:bCs/>
-                <w:sz w:val="20"/>
-                <w:szCs w:val="20"/>
-                <w:lang w:val="en-GB"/>
-              </w:rPr>
-            </w:pPr>
-          </w:p>
-          <w:p>
-            <w:pPr>
-              <w:pStyle w:val="Body"/>
-              <w:pBdr>
-                <w:top w:val="none" w:sz="0" w:space="0" w:color="auto"/>
-                <w:left w:val="none" w:sz="0" w:space="0" w:color="auto"/>
-                <w:bottom w:val="none" w:sz="0" w:space="0" w:color="auto"/>
-                <w:right w:val="none" w:sz="0" w:space="0" w:color="auto"/>
-                <w:between w:val="none" w:sz="0" w:space="0" w:color="auto"/>
-                <w:bar w:val="none" w:sz="0" w:color="auto"/>
-              </w:pBdr>
-              <w:rPr>
-                <w:bCs/>
-                <w:sz w:val="20"/>
-                <w:szCs w:val="20"/>
-                <w:lang w:val="en-GB"/>
-              </w:rPr>
-            </w:pPr>
-          </w:p>
-          <w:p>
-            <w:pPr>
-              <w:pStyle w:val="Body"/>
-              <w:pBdr>
-                <w:top w:val="none" w:sz="0" w:space="0" w:color="auto"/>
-                <w:left w:val="none" w:sz="0" w:space="0" w:color="auto"/>
-                <w:bottom w:val="none" w:sz="0" w:space="0" w:color="auto"/>
-                <w:right w:val="none" w:sz="0" w:space="0" w:color="auto"/>
-                <w:between w:val="none" w:sz="0" w:space="0" w:color="auto"/>
-                <w:bar w:val="none" w:sz="0" w:color="auto"/>
-              </w:pBdr>
-              <w:rPr>
-                <w:bCs/>
-                <w:sz w:val="20"/>
-                <w:szCs w:val="20"/>
-                <w:lang w:val="en-GB"/>
-              </w:rPr>
-            </w:pPr>
-          </w:p>
-          <w:p>
-            <w:pPr>
-              <w:pStyle w:val="Body"/>
-              <w:pBdr>
-                <w:top w:val="none" w:sz="0" w:space="0" w:color="auto"/>
-                <w:left w:val="none" w:sz="0" w:space="0" w:color="auto"/>
-                <w:bottom w:val="none" w:sz="0" w:space="0" w:color="auto"/>
-                <w:right w:val="none" w:sz="0" w:space="0" w:color="auto"/>
-                <w:between w:val="none" w:sz="0" w:space="0" w:color="auto"/>
-                <w:bar w:val="none" w:sz="0" w:color="auto"/>
-              </w:pBdr>
-              <w:rPr>
-                <w:bCs/>
-                <w:sz w:val="20"/>
-                <w:szCs w:val="20"/>
-                <w:lang w:val="en-GB"/>
-              </w:rPr>
-            </w:pPr>
-          </w:p>
-          <w:p>
-            <w:pPr>
-              <w:pStyle w:val="Body"/>
-              <w:pBdr>
-                <w:top w:val="none" w:sz="0" w:space="0" w:color="auto"/>
-                <w:left w:val="none" w:sz="0" w:space="0" w:color="auto"/>
-                <w:bottom w:val="none" w:sz="0" w:space="0" w:color="auto"/>
-                <w:right w:val="none" w:sz="0" w:space="0" w:color="auto"/>
-                <w:between w:val="none" w:sz="0" w:space="0" w:color="auto"/>
-                <w:bar w:val="none" w:sz="0" w:color="auto"/>
-              </w:pBdr>
-              <w:rPr>
-                <w:bCs/>
-                <w:sz w:val="20"/>
-                <w:szCs w:val="20"/>
-                <w:lang w:val="en-GB"/>
-              </w:rPr>
-            </w:pPr>
-          </w:p>
-          <w:p>
-            <w:pPr>
-              <w:pStyle w:val="Body"/>
-              <w:pBdr>
-                <w:top w:val="none" w:sz="0" w:space="0" w:color="auto"/>
-                <w:left w:val="none" w:sz="0" w:space="0" w:color="auto"/>
-                <w:bottom w:val="none" w:sz="0" w:space="0" w:color="auto"/>
-                <w:right w:val="none" w:sz="0" w:space="0" w:color="auto"/>
-                <w:between w:val="none" w:sz="0" w:space="0" w:color="auto"/>
-                <w:bar w:val="none" w:sz="0" w:color="auto"/>
-              </w:pBdr>
-              <w:rPr>
-                <w:bCs/>
-                <w:sz w:val="20"/>
-                <w:szCs w:val="20"/>
-                <w:lang w:val="en-GB"/>
-              </w:rPr>
-            </w:pPr>
-          </w:p>
-          <w:p>
-            <w:pPr>
-              <w:pStyle w:val="Body"/>
-              <w:pBdr>
-                <w:top w:val="none" w:sz="0" w:space="0" w:color="auto"/>
-                <w:left w:val="none" w:sz="0" w:space="0" w:color="auto"/>
-                <w:bottom w:val="none" w:sz="0" w:space="0" w:color="auto"/>
-                <w:right w:val="none" w:sz="0" w:space="0" w:color="auto"/>
-                <w:between w:val="none" w:sz="0" w:space="0" w:color="auto"/>
-                <w:bar w:val="none" w:sz="0" w:color="auto"/>
-              </w:pBdr>
-              <w:rPr>
-                <w:bCs/>
-                <w:sz w:val="20"/>
-                <w:szCs w:val="20"/>
-                <w:lang w:val="en-GB"/>
-              </w:rPr>
-            </w:pPr>
-          </w:p>
-          <w:p>
-            <w:pPr>
-              <w:pStyle w:val="Body"/>
-              <w:pBdr>
-                <w:top w:val="none" w:sz="0" w:space="0" w:color="auto"/>
-                <w:left w:val="none" w:sz="0" w:space="0" w:color="auto"/>
-                <w:bottom w:val="none" w:sz="0" w:space="0" w:color="auto"/>
-                <w:right w:val="none" w:sz="0" w:space="0" w:color="auto"/>
-                <w:between w:val="none" w:sz="0" w:space="0" w:color="auto"/>
-                <w:bar w:val="none" w:sz="0" w:color="auto"/>
-              </w:pBdr>
-              <w:rPr>
-                <w:bCs/>
-                <w:sz w:val="20"/>
-                <w:szCs w:val="20"/>
-                <w:lang w:val="en-GB"/>
-              </w:rPr>
-            </w:pPr>
-          </w:p>
-          <w:p>
-            <w:pPr>
-              <w:pStyle w:val="Body"/>
-              <w:pBdr>
-                <w:top w:val="none" w:sz="0" w:space="0" w:color="auto"/>
-                <w:left w:val="none" w:sz="0" w:space="0" w:color="auto"/>
-                <w:bottom w:val="none" w:sz="0" w:space="0" w:color="auto"/>
-                <w:right w:val="none" w:sz="0" w:space="0" w:color="auto"/>
-                <w:between w:val="none" w:sz="0" w:space="0" w:color="auto"/>
-                <w:bar w:val="none" w:sz="0" w:color="auto"/>
-              </w:pBdr>
-              <w:rPr>
-                <w:bCs/>
-                <w:sz w:val="20"/>
-                <w:szCs w:val="20"/>
-                <w:lang w:val="en-GB"/>
-              </w:rPr>
-            </w:pPr>
-          </w:p>
-          <w:p>
-            <w:pPr>
-              <w:pStyle w:val="Body"/>
-              <w:pBdr>
-                <w:top w:val="none" w:sz="0" w:space="0" w:color="auto"/>
-                <w:left w:val="none" w:sz="0" w:space="0" w:color="auto"/>
-                <w:bottom w:val="none" w:sz="0" w:space="0" w:color="auto"/>
-                <w:right w:val="none" w:sz="0" w:space="0" w:color="auto"/>
-                <w:between w:val="none" w:sz="0" w:space="0" w:color="auto"/>
-                <w:bar w:val="none" w:sz="0" w:color="auto"/>
-              </w:pBdr>
-              <w:rPr>
-                <w:bCs/>
-                <w:sz w:val="20"/>
-                <w:szCs w:val="20"/>
-                <w:lang w:val="en-GB"/>
-              </w:rPr>
-            </w:pPr>
-          </w:p>
-          <w:p>
-            <w:pPr>
-              <w:pStyle w:val="Body"/>
-              <w:pBdr>
-                <w:top w:val="none" w:sz="0" w:space="0" w:color="auto"/>
-                <w:left w:val="none" w:sz="0" w:space="0" w:color="auto"/>
-                <w:bottom w:val="none" w:sz="0" w:space="0" w:color="auto"/>
-                <w:right w:val="none" w:sz="0" w:space="0" w:color="auto"/>
-                <w:between w:val="none" w:sz="0" w:space="0" w:color="auto"/>
-                <w:bar w:val="none" w:sz="0" w:color="auto"/>
-              </w:pBdr>
-              <w:rPr>
-                <w:bCs/>
-                <w:sz w:val="20"/>
-                <w:szCs w:val="20"/>
-                <w:lang w:val="en-GB"/>
-              </w:rPr>
-            </w:pPr>
-          </w:p>
-          <w:p>
-            <w:pPr>
-              <w:pStyle w:val="Body"/>
-              <w:pBdr>
-                <w:top w:val="none" w:sz="0" w:space="0" w:color="auto"/>
-                <w:left w:val="none" w:sz="0" w:space="0" w:color="auto"/>
-                <w:bottom w:val="none" w:sz="0" w:space="0" w:color="auto"/>
-                <w:right w:val="none" w:sz="0" w:space="0" w:color="auto"/>
-                <w:between w:val="none" w:sz="0" w:space="0" w:color="auto"/>
-                <w:bar w:val="none" w:sz="0" w:color="auto"/>
-              </w:pBdr>
-              <w:rPr>
-                <w:bCs/>
-                <w:sz w:val="20"/>
-                <w:szCs w:val="20"/>
-                <w:lang w:val="en-GB"/>
-              </w:rPr>
-            </w:pPr>
-            <w:r>
-              <w:rPr>
-                <w:bCs/>
-                <w:sz w:val="20"/>
-                <w:szCs w:val="20"/>
-                <w:lang w:val="en-GB"/>
-              </w:rPr>
-              <w:t>2023</w:t>
-            </w:r>
-          </w:p>
-          <w:p>
-            <w:pPr>
-              <w:pStyle w:val="Body"/>
-              <w:pBdr>
-                <w:top w:val="none" w:sz="0" w:space="0" w:color="auto"/>
-                <w:left w:val="none" w:sz="0" w:space="0" w:color="auto"/>
-                <w:bottom w:val="none" w:sz="0" w:space="0" w:color="auto"/>
-                <w:right w:val="none" w:sz="0" w:space="0" w:color="auto"/>
-                <w:between w:val="none" w:sz="0" w:space="0" w:color="auto"/>
-                <w:bar w:val="none" w:sz="0" w:color="auto"/>
-              </w:pBdr>
-              <w:rPr>
-                <w:bCs/>
-                <w:sz w:val="20"/>
-                <w:szCs w:val="20"/>
-                <w:lang w:val="en-GB"/>
-              </w:rPr>
-            </w:pPr>
-          </w:p>
-          <w:p>
-            <w:pPr>
-              <w:pStyle w:val="Body"/>
-              <w:pBdr>
-                <w:top w:val="none" w:sz="0" w:space="0" w:color="auto"/>
-                <w:left w:val="none" w:sz="0" w:space="0" w:color="auto"/>
-                <w:bottom w:val="none" w:sz="0" w:space="0" w:color="auto"/>
-                <w:right w:val="none" w:sz="0" w:space="0" w:color="auto"/>
-                <w:between w:val="none" w:sz="0" w:space="0" w:color="auto"/>
-                <w:bar w:val="none" w:sz="0" w:color="auto"/>
-              </w:pBdr>
-              <w:rPr>
-                <w:bCs/>
-                <w:sz w:val="20"/>
-                <w:szCs w:val="20"/>
-                <w:lang w:val="en-GB"/>
-              </w:rPr>
-            </w:pPr>
-          </w:p>
-          <w:p>
-            <w:pPr>
-              <w:pStyle w:val="Body"/>
-              <w:pBdr>
-                <w:top w:val="none" w:sz="0" w:space="0" w:color="auto"/>
-                <w:left w:val="none" w:sz="0" w:space="0" w:color="auto"/>
-                <w:bottom w:val="none" w:sz="0" w:space="0" w:color="auto"/>
-                <w:right w:val="none" w:sz="0" w:space="0" w:color="auto"/>
-                <w:between w:val="none" w:sz="0" w:space="0" w:color="auto"/>
-                <w:bar w:val="none" w:sz="0" w:color="auto"/>
-              </w:pBdr>
-              <w:rPr>
-                <w:bCs/>
-                <w:sz w:val="20"/>
-                <w:szCs w:val="20"/>
-                <w:lang w:val="en-GB"/>
-              </w:rPr>
-            </w:pPr>
-          </w:p>
-          <w:p>
-            <w:pPr>
-              <w:pStyle w:val="Body"/>
-              <w:pBdr>
-                <w:top w:val="none" w:sz="0" w:space="0" w:color="auto"/>
-                <w:left w:val="none" w:sz="0" w:space="0" w:color="auto"/>
-                <w:bottom w:val="none" w:sz="0" w:space="0" w:color="auto"/>
-                <w:right w:val="none" w:sz="0" w:space="0" w:color="auto"/>
-                <w:between w:val="none" w:sz="0" w:space="0" w:color="auto"/>
-                <w:bar w:val="none" w:sz="0" w:color="auto"/>
-              </w:pBdr>
-              <w:rPr>
-                <w:bCs/>
-                <w:sz w:val="20"/>
-                <w:szCs w:val="20"/>
-                <w:lang w:val="en-GB"/>
-              </w:rPr>
-            </w:pPr>
-          </w:p>
-          <w:p>
-            <w:pPr>
-              <w:pStyle w:val="Body"/>
-              <w:pBdr>
-                <w:top w:val="none" w:sz="0" w:space="0" w:color="auto"/>
-                <w:left w:val="none" w:sz="0" w:space="0" w:color="auto"/>
-                <w:bottom w:val="none" w:sz="0" w:space="0" w:color="auto"/>
-                <w:right w:val="none" w:sz="0" w:space="0" w:color="auto"/>
-                <w:between w:val="none" w:sz="0" w:space="0" w:color="auto"/>
-                <w:bar w:val="none" w:sz="0" w:color="auto"/>
-              </w:pBdr>
-              <w:rPr>
-                <w:bCs/>
-                <w:sz w:val="20"/>
-                <w:szCs w:val="20"/>
-                <w:lang w:val="en-GB"/>
-              </w:rPr>
-            </w:pPr>
-          </w:p>
-          <w:p>
-            <w:pPr>
-              <w:pStyle w:val="Body"/>
-              <w:pBdr>
-                <w:top w:val="none" w:sz="0" w:space="0" w:color="auto"/>
-                <w:left w:val="none" w:sz="0" w:space="0" w:color="auto"/>
-                <w:bottom w:val="none" w:sz="0" w:space="0" w:color="auto"/>
-                <w:right w:val="none" w:sz="0" w:space="0" w:color="auto"/>
-                <w:between w:val="none" w:sz="0" w:space="0" w:color="auto"/>
-                <w:bar w:val="none" w:sz="0" w:color="auto"/>
-              </w:pBdr>
-              <w:rPr>
-                <w:bCs/>
-                <w:sz w:val="20"/>
-                <w:szCs w:val="20"/>
-                <w:lang w:val="en-GB"/>
-              </w:rPr>
-            </w:pPr>
-            <w:r>
-              <w:rPr>
-                <w:bCs/>
-                <w:sz w:val="20"/>
-                <w:szCs w:val="20"/>
-                <w:lang w:val="en-GB"/>
-              </w:rPr>
-              <w:t>2022</w:t>
-            </w:r>
-          </w:p>
-          <w:p>
-            <w:pPr>
-              <w:pStyle w:val="Body"/>
-              <w:pBdr>
-                <w:top w:val="none" w:sz="0" w:space="0" w:color="auto"/>
-                <w:left w:val="none" w:sz="0" w:space="0" w:color="auto"/>
-                <w:bottom w:val="none" w:sz="0" w:space="0" w:color="auto"/>
-                <w:right w:val="none" w:sz="0" w:space="0" w:color="auto"/>
-                <w:between w:val="none" w:sz="0" w:space="0" w:color="auto"/>
-                <w:bar w:val="none" w:sz="0" w:color="auto"/>
-              </w:pBdr>
-              <w:rPr>
-                <w:bCs/>
-                <w:sz w:val="20"/>
-                <w:szCs w:val="20"/>
-                <w:lang w:val="en-GB"/>
-              </w:rPr>
-            </w:pPr>
-          </w:p>
-          <w:p>
-            <w:pPr>
-              <w:pStyle w:val="Body"/>
-              <w:pBdr>
-                <w:top w:val="none" w:sz="0" w:space="0" w:color="auto"/>
-                <w:left w:val="none" w:sz="0" w:space="0" w:color="auto"/>
-                <w:bottom w:val="none" w:sz="0" w:space="0" w:color="auto"/>
-                <w:right w:val="none" w:sz="0" w:space="0" w:color="auto"/>
-                <w:between w:val="none" w:sz="0" w:space="0" w:color="auto"/>
-                <w:bar w:val="none" w:sz="0" w:color="auto"/>
-              </w:pBdr>
-              <w:rPr>
-                <w:bCs/>
-                <w:sz w:val="20"/>
-                <w:szCs w:val="20"/>
-                <w:lang w:val="en-GB"/>
-              </w:rPr>
-            </w:pPr>
-          </w:p>
-          <w:p>
-            <w:pPr>
-              <w:pStyle w:val="Body"/>
-              <w:pBdr>
-                <w:top w:val="none" w:sz="0" w:space="0" w:color="auto"/>
-                <w:left w:val="none" w:sz="0" w:space="0" w:color="auto"/>
-                <w:bottom w:val="none" w:sz="0" w:space="0" w:color="auto"/>
-                <w:right w:val="none" w:sz="0" w:space="0" w:color="auto"/>
-                <w:between w:val="none" w:sz="0" w:space="0" w:color="auto"/>
-                <w:bar w:val="none" w:sz="0" w:color="auto"/>
-              </w:pBdr>
-              <w:rPr>
-                <w:bCs/>
-                <w:sz w:val="20"/>
-                <w:szCs w:val="20"/>
-                <w:lang w:val="en-GB"/>
-              </w:rPr>
-            </w:pPr>
-          </w:p>
-          <w:p>
-            <w:pPr>
-              <w:pStyle w:val="Body"/>
-              <w:pBdr>
-                <w:top w:val="none" w:sz="0" w:space="0" w:color="auto"/>
-                <w:left w:val="none" w:sz="0" w:space="0" w:color="auto"/>
-                <w:bottom w:val="none" w:sz="0" w:space="0" w:color="auto"/>
-                <w:right w:val="none" w:sz="0" w:space="0" w:color="auto"/>
-                <w:between w:val="none" w:sz="0" w:space="0" w:color="auto"/>
-                <w:bar w:val="none" w:sz="0" w:color="auto"/>
-              </w:pBdr>
-              <w:rPr>
-                <w:bCs/>
-                <w:sz w:val="20"/>
-                <w:szCs w:val="20"/>
-                <w:lang w:val="en-GB"/>
-              </w:rPr>
-            </w:pPr>
-          </w:p>
-          <w:p>
-            <w:pPr>
-              <w:pStyle w:val="Body"/>
-              <w:pBdr>
-                <w:top w:val="none" w:sz="0" w:space="0" w:color="auto"/>
-                <w:left w:val="none" w:sz="0" w:space="0" w:color="auto"/>
-                <w:bottom w:val="none" w:sz="0" w:space="0" w:color="auto"/>
-                <w:right w:val="none" w:sz="0" w:space="0" w:color="auto"/>
-                <w:between w:val="none" w:sz="0" w:space="0" w:color="auto"/>
-                <w:bar w:val="none" w:sz="0" w:color="auto"/>
-              </w:pBdr>
-              <w:rPr>
-                <w:bCs/>
-                <w:sz w:val="20"/>
-                <w:szCs w:val="20"/>
-                <w:lang w:val="en-GB"/>
-              </w:rPr>
-            </w:pPr>
-          </w:p>
-          <w:p>
-            <w:pPr>
-              <w:pStyle w:val="Body"/>
-              <w:pBdr>
-                <w:top w:val="none" w:sz="0" w:space="0" w:color="auto"/>
-                <w:left w:val="none" w:sz="0" w:space="0" w:color="auto"/>
-                <w:bottom w:val="none" w:sz="0" w:space="0" w:color="auto"/>
-                <w:right w:val="none" w:sz="0" w:space="0" w:color="auto"/>
-                <w:between w:val="none" w:sz="0" w:space="0" w:color="auto"/>
-                <w:bar w:val="none" w:sz="0" w:color="auto"/>
-              </w:pBdr>
-              <w:rPr>
-                <w:bCs/>
-                <w:sz w:val="20"/>
-                <w:szCs w:val="20"/>
-                <w:lang w:val="en-GB"/>
-              </w:rPr>
-            </w:pPr>
-            <w:r>
-              <w:rPr>
-                <w:bCs/>
-                <w:sz w:val="20"/>
-                <w:szCs w:val="20"/>
-                <w:lang w:val="en-GB"/>
-              </w:rPr>
-              <w:t>2021</w:t>
-            </w:r>
+              <w:jc w:val="both"/>
+              <w:rPr>
+                <w:sz w:val="20"/>
+                <w:szCs w:val="20"/>
+                <w:lang w:val="en-GB"/>
+              </w:rPr>
+            </w:pPr>
           </w:p>
         </w:tc>
         <w:tc>
@@ -6903,6 +6295,48 @@
               </w:rPr>
             </w:pPr>
           </w:p>
+        </w:tc>
+      </w:tr>
+      <w:tr>
+        <w:trPr>
+          <w:trHeight w:val="285"/>
+          <w:cantSplit/>
+        </w:trPr>
+        <w:tc>
+          <w:tcPr>
+            <w:tcW w:w="1702" w:type="dxa"/>
+            <w:tcBorders>
+              <w:top w:val="nil" w:sz="4" w:space="0" w:color="auto"/>
+            </w:tcBorders>
+          </w:tcPr>
+          <w:p>
+            <w:pPr>
+              <w:pStyle w:val="Body"/>
+              <w:pBdr>
+                <w:top w:val="none" w:sz="0" w:space="0" w:color="auto"/>
+                <w:left w:val="none" w:sz="0" w:space="0" w:color="auto"/>
+                <w:bottom w:val="none" w:sz="0" w:space="0" w:color="auto"/>
+                <w:right w:val="none" w:sz="0" w:space="0" w:color="auto"/>
+                <w:between w:val="none" w:sz="0" w:space="0" w:color="auto"/>
+                <w:bar w:val="none" w:sz="0" w:color="auto"/>
+              </w:pBdr>
+              <w:rPr>
+                <w:bCs/>
+                <w:sz w:val="20"/>
+                <w:szCs w:val="20"/>
+                <w:lang w:val="en-GB"/>
+              </w:rPr>
+            </w:pPr>
+            <w:r>
+              <w:rPr>
+                <w:bCs/>
+                <w:sz w:val="20"/>
+                <w:szCs w:val="20"/>
+                <w:lang w:val="en-GB"/>
+              </w:rPr>
+              <w:t>2025</w:t>
+            </w:r>
+          </w:p>
           <w:p>
             <w:pPr>
               <w:pStyle w:val="Body"/>
@@ -6913,6 +6347,26 @@
                 <w:lang w:val="en-GB"/>
               </w:rPr>
             </w:pPr>
+          </w:p>
+        </w:tc>
+        <w:tc>
+          <w:tcPr>
+            <w:tcW w:w="8038" w:type="dxa"/>
+            <w:gridSpan w:val="2"/>
+            <w:tcBorders>
+              <w:top w:val="nil" w:sz="4" w:space="0" w:color="auto"/>
+            </w:tcBorders>
+          </w:tcPr>
+          <w:p>
+            <w:pPr>
+              <w:pStyle w:val="Body"/>
+              <w:jc w:val="both"/>
+              <w:rPr>
+                <w:sz w:val="20"/>
+                <w:szCs w:val="20"/>
+                <w:lang w:val="en-GB"/>
+              </w:rPr>
+            </w:pPr>
             <w:r>
               <w:rPr>
                 <w:sz w:val="20"/>
@@ -6967,6 +6421,48 @@
               </w:rPr>
             </w:pPr>
           </w:p>
+        </w:tc>
+      </w:tr>
+      <w:tr>
+        <w:trPr>
+          <w:trHeight w:val="285"/>
+          <w:cantSplit/>
+        </w:trPr>
+        <w:tc>
+          <w:tcPr>
+            <w:tcW w:w="1702" w:type="dxa"/>
+            <w:tcBorders>
+              <w:top w:val="nil" w:sz="4" w:space="0" w:color="auto"/>
+            </w:tcBorders>
+          </w:tcPr>
+          <w:p>
+            <w:pPr>
+              <w:pStyle w:val="Body"/>
+              <w:pBdr>
+                <w:top w:val="none" w:sz="0" w:space="0" w:color="auto"/>
+                <w:left w:val="none" w:sz="0" w:space="0" w:color="auto"/>
+                <w:bottom w:val="none" w:sz="0" w:space="0" w:color="auto"/>
+                <w:right w:val="none" w:sz="0" w:space="0" w:color="auto"/>
+                <w:between w:val="none" w:sz="0" w:space="0" w:color="auto"/>
+                <w:bar w:val="none" w:sz="0" w:color="auto"/>
+              </w:pBdr>
+              <w:rPr>
+                <w:bCs/>
+                <w:sz w:val="20"/>
+                <w:szCs w:val="20"/>
+                <w:lang w:val="en-GB"/>
+              </w:rPr>
+            </w:pPr>
+            <w:r>
+              <w:rPr>
+                <w:bCs/>
+                <w:sz w:val="20"/>
+                <w:szCs w:val="20"/>
+                <w:lang w:val="en-GB"/>
+              </w:rPr>
+              <w:t>2024</w:t>
+            </w:r>
+          </w:p>
           <w:p>
             <w:pPr>
               <w:pStyle w:val="Body"/>
@@ -6974,6 +6470,26 @@
               <w:rPr>
                 <w:sz w:val="20"/>
                 <w:szCs w:val="20"/>
+                <w:lang w:val="en-GB"/>
+              </w:rPr>
+            </w:pPr>
+          </w:p>
+        </w:tc>
+        <w:tc>
+          <w:tcPr>
+            <w:tcW w:w="8038" w:type="dxa"/>
+            <w:gridSpan w:val="2"/>
+            <w:tcBorders>
+              <w:top w:val="nil" w:sz="4" w:space="0" w:color="auto"/>
+            </w:tcBorders>
+          </w:tcPr>
+          <w:p>
+            <w:pPr>
+              <w:pStyle w:val="Body"/>
+              <w:jc w:val="both"/>
+              <w:rPr>
+                <w:sz w:val="20"/>
+                <w:szCs w:val="20"/>
               </w:rPr>
             </w:pPr>
             <w:r>
@@ -7118,6 +6634,68 @@
               </w:rPr>
             </w:pPr>
           </w:p>
+        </w:tc>
+      </w:tr>
+      <w:tr>
+        <w:trPr>
+          <w:trHeight w:val="285"/>
+          <w:cantSplit/>
+        </w:trPr>
+        <w:tc>
+          <w:tcPr>
+            <w:tcW w:w="1702" w:type="dxa"/>
+            <w:tcBorders>
+              <w:top w:val="nil" w:sz="4" w:space="0" w:color="auto"/>
+            </w:tcBorders>
+          </w:tcPr>
+          <w:p>
+            <w:pPr>
+              <w:pStyle w:val="Body"/>
+              <w:pBdr>
+                <w:top w:val="none" w:sz="0" w:space="0" w:color="auto"/>
+                <w:left w:val="none" w:sz="0" w:space="0" w:color="auto"/>
+                <w:bottom w:val="none" w:sz="0" w:space="0" w:color="auto"/>
+                <w:right w:val="none" w:sz="0" w:space="0" w:color="auto"/>
+                <w:between w:val="none" w:sz="0" w:space="0" w:color="auto"/>
+                <w:bar w:val="none" w:sz="0" w:color="auto"/>
+              </w:pBdr>
+              <w:rPr>
+                <w:bCs/>
+                <w:sz w:val="20"/>
+                <w:szCs w:val="20"/>
+                <w:lang w:val="en-GB"/>
+              </w:rPr>
+            </w:pPr>
+            <w:r>
+              <w:rPr>
+                <w:bCs/>
+                <w:sz w:val="20"/>
+                <w:szCs w:val="20"/>
+                <w:lang w:val="en-GB"/>
+              </w:rPr>
+              <w:t>2023</w:t>
+            </w:r>
+          </w:p>
+          <w:p>
+            <w:pPr>
+              <w:pStyle w:val="Body"/>
+              <w:jc w:val="both"/>
+              <w:rPr>
+                <w:sz w:val="20"/>
+                <w:szCs w:val="20"/>
+                <w:lang w:val="en-GB"/>
+              </w:rPr>
+            </w:pPr>
+          </w:p>
+        </w:tc>
+        <w:tc>
+          <w:tcPr>
+            <w:tcW w:w="8038" w:type="dxa"/>
+            <w:gridSpan w:val="2"/>
+            <w:tcBorders>
+              <w:top w:val="nil" w:sz="4" w:space="0" w:color="auto"/>
+            </w:tcBorders>
+          </w:tcPr>
           <w:p>
             <w:pPr>
               <w:pStyle w:val="Body"/>
@@ -7242,6 +6820,48 @@
               </w:rPr>
             </w:pPr>
           </w:p>
+        </w:tc>
+      </w:tr>
+      <w:tr>
+        <w:trPr>
+          <w:trHeight w:val="285"/>
+          <w:cantSplit/>
+        </w:trPr>
+        <w:tc>
+          <w:tcPr>
+            <w:tcW w:w="1702" w:type="dxa"/>
+            <w:tcBorders>
+              <w:top w:val="nil" w:sz="4" w:space="0" w:color="auto"/>
+            </w:tcBorders>
+          </w:tcPr>
+          <w:p>
+            <w:pPr>
+              <w:pStyle w:val="Body"/>
+              <w:pBdr>
+                <w:top w:val="none" w:sz="0" w:space="0" w:color="auto"/>
+                <w:left w:val="none" w:sz="0" w:space="0" w:color="auto"/>
+                <w:bottom w:val="none" w:sz="0" w:space="0" w:color="auto"/>
+                <w:right w:val="none" w:sz="0" w:space="0" w:color="auto"/>
+                <w:between w:val="none" w:sz="0" w:space="0" w:color="auto"/>
+                <w:bar w:val="none" w:sz="0" w:color="auto"/>
+              </w:pBdr>
+              <w:rPr>
+                <w:bCs/>
+                <w:sz w:val="20"/>
+                <w:szCs w:val="20"/>
+                <w:lang w:val="en-GB"/>
+              </w:rPr>
+            </w:pPr>
+            <w:r>
+              <w:rPr>
+                <w:bCs/>
+                <w:sz w:val="20"/>
+                <w:szCs w:val="20"/>
+                <w:lang w:val="en-GB"/>
+              </w:rPr>
+              <w:t>2022</w:t>
+            </w:r>
+          </w:p>
           <w:p>
             <w:pPr>
               <w:pStyle w:val="Body"/>
@@ -7252,6 +6872,26 @@
                 <w:lang w:val="en-GB"/>
               </w:rPr>
             </w:pPr>
+          </w:p>
+        </w:tc>
+        <w:tc>
+          <w:tcPr>
+            <w:tcW w:w="8038" w:type="dxa"/>
+            <w:gridSpan w:val="2"/>
+            <w:tcBorders>
+              <w:top w:val="nil" w:sz="4" w:space="0" w:color="auto"/>
+            </w:tcBorders>
+          </w:tcPr>
+          <w:p>
+            <w:pPr>
+              <w:pStyle w:val="Body"/>
+              <w:jc w:val="both"/>
+              <w:rPr>
+                <w:sz w:val="20"/>
+                <w:szCs w:val="20"/>
+                <w:lang w:val="en-GB"/>
+              </w:rPr>
+            </w:pPr>
             <w:r>
               <w:rPr>
                 <w:sz w:val="20"/>
@@ -7290,6 +6930,57 @@
               </w:rPr>
             </w:pPr>
           </w:p>
+        </w:tc>
+      </w:tr>
+      <w:tr>
+        <w:trPr>
+          <w:trHeight w:val="285"/>
+          <w:cantSplit/>
+        </w:trPr>
+        <w:tc>
+          <w:tcPr>
+            <w:tcW w:w="1702" w:type="dxa"/>
+            <w:tcBorders>
+              <w:top w:val="nil" w:sz="4" w:space="0" w:color="auto"/>
+            </w:tcBorders>
+          </w:tcPr>
+          <w:p>
+            <w:pPr>
+              <w:pStyle w:val="Body"/>
+              <w:pBdr>
+                <w:top w:val="none" w:sz="0" w:space="0" w:color="auto"/>
+                <w:left w:val="none" w:sz="0" w:space="0" w:color="auto"/>
+                <w:bottom w:val="none" w:sz="0" w:space="0" w:color="auto"/>
+                <w:right w:val="none" w:sz="0" w:space="0" w:color="auto"/>
+                <w:between w:val="none" w:sz="0" w:space="0" w:color="auto"/>
+                <w:bar w:val="none" w:sz="0" w:color="auto"/>
+              </w:pBdr>
+              <w:rPr>
+                <w:bCs/>
+                <w:sz w:val="20"/>
+                <w:szCs w:val="20"/>
+                <w:lang w:val="en-GB"/>
+              </w:rPr>
+            </w:pPr>
+            <w:r>
+              <w:rPr>
+                <w:bCs/>
+                <w:sz w:val="20"/>
+                <w:szCs w:val="20"/>
+                <w:lang w:val="en-GB"/>
+              </w:rPr>
+              <w:t>2021</w:t>
+            </w:r>
+          </w:p>
+        </w:tc>
+        <w:tc>
+          <w:tcPr>
+            <w:tcW w:w="8038" w:type="dxa"/>
+            <w:gridSpan w:val="2"/>
+            <w:tcBorders>
+              <w:top w:val="nil" w:sz="4" w:space="0" w:color="auto"/>
+            </w:tcBorders>
+          </w:tcPr>
           <w:p>
             <w:pPr>
               <w:pStyle w:val="Body"/>

</xml_diff>

<commit_message>
Update AI draft and clean stale papers
</commit_message>
<xml_diff>
--- a/papers/CV/JONATHON HAZELL.docx
+++ b/papers/CV/JONATHON HAZELL.docx
@@ -2701,7 +2701,7 @@
                 <w:szCs w:val="20"/>
                 <w:lang w:val="en-GB"/>
               </w:rPr>
-              <w:t>“The Macroeconomic Effect of AI: Sizing the Software Engineering Channel.” With Alex Blumenfeld, Chen Lian and Andreas Schaab. July 2026. Preliminary draft.</w:t>
+              <w:t>“The Macroeconomic Effect of AI: Sizing the Software Engineering Channel.” With Alex Blumenfeld, Chen Lian and Andreas Schaab. September 2026.</w:t>
             </w:r>
           </w:p>
           <w:p>
@@ -3012,7 +3012,7 @@
                 <w:szCs w:val="20"/>
                 <w:lang w:val="en-GB"/>
               </w:rPr>
-              <w:t> Laura</w:t>
+              <w:t xml:space="preserve"> Laura</w:t>
             </w:r>
             <w:proofErr w:type="gramEnd"/>
             <w:r>
@@ -3208,7 +3208,6 @@
                 <w:szCs w:val="20"/>
                 <w:lang w:val="en-GB"/>
               </w:rPr>
-              <w:lastRenderedPageBreak/>
               <w:t>Publications</w:t>
             </w:r>
             <w:r>
@@ -3373,7 +3372,7 @@
                 <w:szCs w:val="20"/>
                 <w:lang w:val="en-GB"/>
               </w:rPr>
-              <w:t>“Bonus Question: How Does Flexible Incentive Pay Affect Wage Rigidity?” With Meghana Gaur, John Grigsby and Abdoulaye Ndiaye.  202</w:t>
+              <w:t>“Bonus Question: How Does Flexible Incentive Pay Affect Unemployment Dynamics?” With Meghana Gaur, John Grigsby and Abdoulaye Ndiaye.  202</w:t>
             </w:r>
             <w:r>
               <w:rPr>
@@ -3556,7 +3555,7 @@
                 <w:szCs w:val="20"/>
                 <w:lang w:val="en-GB"/>
               </w:rPr>
-              <w:t>Long Term</w:t>
+              <w:t>Long-Term</w:t>
             </w:r>
             <w:proofErr w:type="gramEnd"/>
             <w:r>
@@ -4016,7 +4015,7 @@
                 <w:szCs w:val="20"/>
                 <w:lang w:val="en-GB"/>
               </w:rPr>
-              <w:t xml:space="preserve">“AI and Jobs: Evidence from Online Vacancies.” With Daron Acemoglu, David Autor and Pascual Restrepo. </w:t>
+              <w:t xml:space="preserve">“Artificial Intelligence and Jobs: Evidence from Online Vacancies.” With Daron Acemoglu, David Autor and Pascual Restrepo. </w:t>
             </w:r>
             <w:r>
               <w:rPr>
@@ -4095,7 +4094,7 @@
                 <w:szCs w:val="20"/>
                 <w:lang w:val="en-GB"/>
               </w:rPr>
-              <w:t xml:space="preserve">“Systemic Risk-Shifting in Financial Networks.” With Matthew Elliott and Co-Pierre Georg. </w:t>
+              <w:t xml:space="preserve">“Systemic Risk Shifting in Financial Networks.” With Matthew Elliott and Co-Pierre Georg. </w:t>
             </w:r>
             <w:r>
               <w:rPr>
@@ -5796,7 +5795,6 @@
                 <w:szCs w:val="20"/>
                 <w:lang w:val="en-GB"/>
               </w:rPr>
-              <w:lastRenderedPageBreak/>
               <w:t>2013</w:t>
             </w:r>
           </w:p>
@@ -7208,7 +7206,6 @@
                 <w:szCs w:val="20"/>
                 <w:lang w:val="en-GB"/>
               </w:rPr>
-              <w:lastRenderedPageBreak/>
               <w:t>2019</w:t>
             </w:r>
           </w:p>

</xml_diff>

<commit_message>
Add HouseholdBench paper, news item and CV entry
Co-Authored-By: Claude Opus 5.5 <noreply@anthropic.com>
</commit_message>
<xml_diff>
--- a/papers/CV/JONATHON HAZELL.docx
+++ b/papers/CV/JONATHON HAZELL.docx
@@ -88,7 +88,7 @@
                 <w:szCs w:val="20"/>
                 <w:lang w:val="en-GB"/>
               </w:rPr>
-              <w:t>September 2026</w:t>
+              <w:t>October 2026</w:t>
             </w:r>
             <w:r>
               <w:rPr>
@@ -2539,6 +2539,58 @@
               <w:top w:val="single" w:sz="4" w:space="0" w:color="auto"/>
             </w:tcBorders>
           </w:tcPr>
+          <w:p>
+            <w:pPr>
+              <w:pStyle w:val="Body"/>
+              <w:keepLines/>
+              <w:pBdr>
+                <w:top w:val="none" w:sz="0" w:space="0" w:color="auto"/>
+                <w:left w:val="none" w:sz="0" w:space="0" w:color="auto"/>
+                <w:bottom w:val="none" w:sz="0" w:space="0" w:color="auto"/>
+                <w:right w:val="none" w:sz="0" w:space="0" w:color="auto"/>
+                <w:between w:val="none" w:sz="0" w:space="0" w:color="auto"/>
+                <w:bar w:val="none" w:sz="0" w:color="auto"/>
+              </w:pBdr>
+              <w:ind w:left="720"/>
+              <w:jc w:val="both"/>
+              <w:rPr>
+                <w:bCs/>
+                <w:sz w:val="20"/>
+                <w:szCs w:val="20"/>
+                <w:lang w:val="en-GB"/>
+              </w:rPr>
+            </w:pPr>
+            <w:r>
+              <w:rPr>
+                <w:bCs/>
+                <w:sz w:val="20"/>
+                <w:szCs w:val="20"/>
+                <w:lang w:val="en-GB"/>
+              </w:rPr>
+              <w:t>“HouseholdBench: Evaluating Large Language Models as Predictors of Household Economic Behavior.” With Jin Huang, Diego Ferreras Garrucho, Yutong Xie, Walter M. Yuan, Qiaozhu Mei and Chen Lian. October 2026.</w:t>
+            </w:r>
+          </w:p>
+          <w:p>
+            <w:pPr>
+              <w:pStyle w:val="Body"/>
+              <w:pBdr>
+                <w:top w:val="none" w:sz="0" w:space="0" w:color="auto"/>
+                <w:left w:val="none" w:sz="0" w:space="0" w:color="auto"/>
+                <w:bottom w:val="none" w:sz="0" w:space="0" w:color="auto"/>
+                <w:right w:val="none" w:sz="0" w:space="0" w:color="auto"/>
+                <w:between w:val="none" w:sz="0" w:space="0" w:color="auto"/>
+                <w:bar w:val="none" w:sz="0" w:color="auto"/>
+              </w:pBdr>
+              <w:ind w:left="720"/>
+              <w:jc w:val="both"/>
+              <w:rPr>
+                <w:bCs/>
+                <w:sz w:val="20"/>
+                <w:szCs w:val="20"/>
+                <w:lang w:val="en-GB"/>
+              </w:rPr>
+            </w:pPr>
+          </w:p>
           <w:p>
             <w:pPr>
               <w:pStyle w:val="Body"/>

</xml_diff>